<commit_message>
docs: finalize hybrid visuals and math v2, documentation reached 47 pages
</commit_message>
<xml_diff>
--- a/docs/thesis/check_pages/THESIS_1_THEORY.docx
+++ b/docs/thesis/check_pages/THESIS_1_THEORY.docx
@@ -216,7 +216,7 @@
         </w:rPr>
         <w:lastRenderedPageBreak/>
         <w:drawing>
-          <wp:inline distT="0" distB="0" distL="0" distR="0" wp14:anchorId="52F01659" wp14:editId="5F962B06">
+          <wp:inline distT="0" distB="0" distL="0" distR="0" wp14:anchorId="488CD97E" wp14:editId="5E808BD1">
             <wp:extent cx="5580000" cy="4366957"/>
             <wp:effectExtent l="0" t="0" r="0" b="0"/>
             <wp:docPr id="1" name="Picture 1"/>
@@ -448,7 +448,7 @@
           <w:noProof/>
         </w:rPr>
         <w:drawing>
-          <wp:inline distT="0" distB="0" distL="0" distR="0" wp14:anchorId="1EFD6517" wp14:editId="7A1BEA02">
+          <wp:inline distT="0" distB="0" distL="0" distR="0" wp14:anchorId="0480B0FD" wp14:editId="58128824">
             <wp:extent cx="2880000" cy="7399858"/>
             <wp:effectExtent l="0" t="0" r="0" b="0"/>
             <wp:docPr id="2" name="Picture 2"/>
@@ -2750,7 +2750,7 @@
         </w:rPr>
         <w:lastRenderedPageBreak/>
         <w:drawing>
-          <wp:inline distT="0" distB="0" distL="0" distR="0" wp14:anchorId="1BED59F2" wp14:editId="7BA05F45">
+          <wp:inline distT="0" distB="0" distL="0" distR="0" wp14:anchorId="59FDA9B0" wp14:editId="7363B241">
             <wp:extent cx="2880000" cy="5135510"/>
             <wp:effectExtent l="0" t="0" r="0" b="0"/>
             <wp:docPr id="3" name="Picture 3"/>
@@ -3655,31 +3655,31 @@
       </w:rPr>
     </w:lvl>
   </w:abstractNum>
-  <w:num w:numId="1" w16cid:durableId="1387560266">
+  <w:num w:numId="1" w16cid:durableId="1463958608">
     <w:abstractNumId w:val="8"/>
   </w:num>
-  <w:num w:numId="2" w16cid:durableId="276060218">
+  <w:num w:numId="2" w16cid:durableId="2051614805">
     <w:abstractNumId w:val="6"/>
   </w:num>
-  <w:num w:numId="3" w16cid:durableId="2028679403">
+  <w:num w:numId="3" w16cid:durableId="2111074337">
     <w:abstractNumId w:val="5"/>
   </w:num>
-  <w:num w:numId="4" w16cid:durableId="1025179758">
+  <w:num w:numId="4" w16cid:durableId="1564290634">
     <w:abstractNumId w:val="4"/>
   </w:num>
-  <w:num w:numId="5" w16cid:durableId="1494295487">
+  <w:num w:numId="5" w16cid:durableId="1963418420">
     <w:abstractNumId w:val="7"/>
   </w:num>
-  <w:num w:numId="6" w16cid:durableId="1512911548">
+  <w:num w:numId="6" w16cid:durableId="1288127573">
     <w:abstractNumId w:val="3"/>
   </w:num>
-  <w:num w:numId="7" w16cid:durableId="527334331">
+  <w:num w:numId="7" w16cid:durableId="342367464">
     <w:abstractNumId w:val="2"/>
   </w:num>
-  <w:num w:numId="8" w16cid:durableId="1385451977">
+  <w:num w:numId="8" w16cid:durableId="1931810735">
     <w:abstractNumId w:val="1"/>
   </w:num>
-  <w:num w:numId="9" w16cid:durableId="1940604335">
+  <w:num w:numId="9" w16cid:durableId="1810438977">
     <w:abstractNumId w:val="0"/>
   </w:num>
 </w:numbering>

</xml_diff>